<commit_message>
Add confirmed SSR, WebSockets, and shared skills to the software engineer CV.
Co-authored-by: Mohamed Mostafa <dev.xmuhameed@gmail.com>
</commit_message>
<xml_diff>
--- a/Mohamed_Mostafa-Software_Engineer.docx
+++ b/Mohamed_Mostafa-Software_Engineer.docx
@@ -93,7 +93,7 @@
           <w:sz w:val="22"/>
           <w:u w:val="none"/>
         </w:rPr>
-        <w:t>Software Engineer with 4+ years of experience delivering production software for enterprise systems, event management, facility management, and e-commerce across the software development life cycle (SDLC). Builds full-stack applications with React.js, Next.js, Node.js, NestJS, TypeScript, PostgreSQL, and REST (Representational State Transfer) application programming interfaces (APIs). Shipped 20+ production applications used by 100,000+ users, including a facility management platform for 15,000+ users. Improved configuration efficiency by 40%, cut load times by up to 25%, and grew organic traffic by 20% through performance work and search engine optimization (SEO), with cross-functional Agile teams.</w:t>
+        <w:t>Software Engineer with 4+ years of experience delivering production software for enterprise systems, event management, facility management, and e-commerce across the software development life cycle (SDLC). Builds full-stack applications with React.js, Next.js server-side rendering (SSR) and the App Router, Node.js, NestJS, TypeScript, PostgreSQL, WebSockets (Socket.io), and REST (Representational State Transfer) application programming interfaces (APIs). Shipped 20+ production applications used by 100,000+ users, including a facility management platform for 15,000+ users. Improved configuration efficiency by 40%, cut load times by up to 25%, and grew organic traffic by 20% through performance work and search engine optimization (SEO), with cross-functional Agile teams.</w:t>
       </w:r>
     </w:p>
     <w:p>
@@ -173,7 +173,7 @@
           <w:sz w:val="22"/>
           <w:u w:val="none"/>
         </w:rPr>
-        <w:t>React.js, Next.js, Tailwind CSS, Redux Toolkit and Zustand for state management, Bootstrap, Three.js, responsive web design (HTML and CSS)</w:t>
+        <w:t>React.js, Next.js (server-side rendering (SSR) and App Router), Tailwind CSS, SCSS (Sass), React Hook Form, Zod, Redux Toolkit and Zustand for state management, Bootstrap, Three.js, responsive web design (HTML and CSS)</w:t>
       </w:r>
     </w:p>
     <w:p>
@@ -202,7 +202,7 @@
           <w:sz w:val="22"/>
           <w:u w:val="none"/>
         </w:rPr>
-        <w:t>Node.js, NestJS (Nest.js), Express.js, REST APIs, Prisma ORM (object-relational mapping), secure JSON Web Token (JWT) authentication and authorization</w:t>
+        <w:t>Node.js, NestJS (Nest.js), Express.js, REST APIs, WebSockets (Socket.io), Prisma ORM (object-relational mapping), secure JSON Web Token (JWT) authentication and authorization</w:t>
       </w:r>
     </w:p>
     <w:p>
@@ -260,7 +260,7 @@
           <w:sz w:val="22"/>
           <w:u w:val="none"/>
         </w:rPr>
-        <w:t>Git, GitHub (version control), CI/CD (continuous integration and continuous delivery) with GitHub Actions, Postman, Figma, Stripe, Tabby, Google Analytics, Meta Pixel, Agile</w:t>
+        <w:t>Git, GitHub (version control), CI/CD (continuous integration and continuous delivery) with GitHub Actions, Vercel, Postman, Figma, Stripe, Tabby, Google Analytics, Meta Pixel, Agile</w:t>
       </w:r>
     </w:p>
     <w:p>
@@ -550,7 +550,7 @@
           <w:sz w:val="22"/>
           <w:u w:val="none"/>
         </w:rPr>
-        <w:t>• Built real-time dashboards with NestJS and optimized backend performance for PostgreSQL enterprise systems.</w:t>
+        <w:t>• Built real-time dashboards with NestJS and WebSockets (Socket.io), and optimized backend performance for PostgreSQL enterprise systems.</w:t>
       </w:r>
     </w:p>
     <w:p>

</xml_diff>